<commit_message>
Updated report with full source code
</commit_message>
<xml_diff>
--- a/self_pruning_report.docx
+++ b/self_pruning_report.docx
@@ -65,7 +65,1857 @@
         <w:pStyle w:val="Heading1"/>
       </w:pPr>
       <w:r>
-        <w:t>2. Results: Effect of λ on Accuracy and Sparsity</w:t>
+        <w:t xml:space="preserve">2. </w:t>
+      </w:r>
+      <w:r>
+        <w:t>Full Source Code</w:t>
+      </w:r>
+    </w:p>
+    <w:p>
+      <w:r>
+        <w:t>import torch</w:t>
+      </w:r>
+      <w:r>
+        <w:br/>
+        <w:t xml:space="preserve">import </w:t>
+      </w:r>
+      <w:proofErr w:type="spellStart"/>
+      <w:proofErr w:type="gramStart"/>
+      <w:r>
+        <w:t>torch.nn</w:t>
+      </w:r>
+      <w:proofErr w:type="spellEnd"/>
+      <w:proofErr w:type="gramEnd"/>
+      <w:r>
+        <w:t xml:space="preserve"> as </w:t>
+      </w:r>
+      <w:proofErr w:type="spellStart"/>
+      <w:r>
+        <w:t>nn</w:t>
+      </w:r>
+      <w:proofErr w:type="spellEnd"/>
+      <w:r>
+        <w:br/>
+        <w:t xml:space="preserve">import </w:t>
+      </w:r>
+      <w:proofErr w:type="spellStart"/>
+      <w:r>
+        <w:t>torch.optim</w:t>
+      </w:r>
+      <w:proofErr w:type="spellEnd"/>
+      <w:r>
+        <w:t xml:space="preserve"> as </w:t>
+      </w:r>
+      <w:proofErr w:type="spellStart"/>
+      <w:r>
+        <w:t>optim</w:t>
+      </w:r>
+      <w:proofErr w:type="spellEnd"/>
+      <w:r>
+        <w:br/>
+        <w:t xml:space="preserve">import </w:t>
+      </w:r>
+      <w:proofErr w:type="spellStart"/>
+      <w:r>
+        <w:t>torchvision</w:t>
+      </w:r>
+      <w:proofErr w:type="spellEnd"/>
+      <w:r>
+        <w:br/>
+        <w:t xml:space="preserve">import </w:t>
+      </w:r>
+      <w:proofErr w:type="spellStart"/>
+      <w:r>
+        <w:t>torchvision.transforms</w:t>
+      </w:r>
+      <w:proofErr w:type="spellEnd"/>
+      <w:r>
+        <w:t xml:space="preserve"> as transforms</w:t>
+      </w:r>
+      <w:r>
+        <w:br/>
+        <w:t xml:space="preserve">import </w:t>
+      </w:r>
+      <w:proofErr w:type="spellStart"/>
+      <w:r>
+        <w:t>matplotlib.pyplot</w:t>
+      </w:r>
+      <w:proofErr w:type="spellEnd"/>
+      <w:r>
+        <w:t xml:space="preserve"> as </w:t>
+      </w:r>
+      <w:proofErr w:type="spellStart"/>
+      <w:r>
+        <w:t>plt</w:t>
+      </w:r>
+      <w:proofErr w:type="spellEnd"/>
+      <w:r>
+        <w:br/>
+        <w:t xml:space="preserve">import </w:t>
+      </w:r>
+      <w:proofErr w:type="spellStart"/>
+      <w:r>
+        <w:t>numpy</w:t>
+      </w:r>
+      <w:proofErr w:type="spellEnd"/>
+      <w:r>
+        <w:t xml:space="preserve"> as np</w:t>
+      </w:r>
+      <w:r>
+        <w:br/>
+      </w:r>
+      <w:r>
+        <w:br/>
+        <w:t># Device setup</w:t>
+      </w:r>
+      <w:r>
+        <w:br/>
+        <w:t xml:space="preserve">device = </w:t>
+      </w:r>
+      <w:proofErr w:type="spellStart"/>
+      <w:r>
+        <w:t>torch.device</w:t>
+      </w:r>
+      <w:proofErr w:type="spellEnd"/>
+      <w:r>
+        <w:t>("</w:t>
+      </w:r>
+      <w:proofErr w:type="spellStart"/>
+      <w:r>
+        <w:t>cuda</w:t>
+      </w:r>
+      <w:proofErr w:type="spellEnd"/>
+      <w:r>
+        <w:t xml:space="preserve">" if </w:t>
+      </w:r>
+      <w:proofErr w:type="spellStart"/>
+      <w:r>
+        <w:t>torch.cuda.is_available</w:t>
+      </w:r>
+      <w:proofErr w:type="spellEnd"/>
+      <w:r>
+        <w:t>() else "</w:t>
+      </w:r>
+      <w:proofErr w:type="spellStart"/>
+      <w:r>
+        <w:t>cpu</w:t>
+      </w:r>
+      <w:proofErr w:type="spellEnd"/>
+      <w:r>
+        <w:t>")</w:t>
+      </w:r>
+      <w:r>
+        <w:br/>
+      </w:r>
+      <w:r>
+        <w:br/>
+      </w:r>
+      <w:r>
+        <w:br/>
+        <w:t># =========================</w:t>
+      </w:r>
+      <w:r>
+        <w:br/>
+        <w:t># 1. PRUNABLE LINEAR LAYER</w:t>
+      </w:r>
+      <w:r>
+        <w:br/>
+        <w:t># =========================</w:t>
+      </w:r>
+      <w:r>
+        <w:br/>
+        <w:t xml:space="preserve">class </w:t>
+      </w:r>
+      <w:proofErr w:type="spellStart"/>
+      <w:r>
+        <w:t>PrunableLinear</w:t>
+      </w:r>
+      <w:proofErr w:type="spellEnd"/>
+      <w:r>
+        <w:t>(</w:t>
+      </w:r>
+      <w:proofErr w:type="spellStart"/>
+      <w:r>
+        <w:t>nn.Module</w:t>
+      </w:r>
+      <w:proofErr w:type="spellEnd"/>
+      <w:r>
+        <w:t>):</w:t>
+      </w:r>
+      <w:r>
+        <w:br/>
+        <w:t xml:space="preserve">    def __</w:t>
+      </w:r>
+      <w:proofErr w:type="spellStart"/>
+      <w:r>
+        <w:t>init</w:t>
+      </w:r>
+      <w:proofErr w:type="spellEnd"/>
+      <w:r>
+        <w:t xml:space="preserve">__(self, </w:t>
+      </w:r>
+      <w:proofErr w:type="spellStart"/>
+      <w:r>
+        <w:t>in_features</w:t>
+      </w:r>
+      <w:proofErr w:type="spellEnd"/>
+      <w:r>
+        <w:t xml:space="preserve">, </w:t>
+      </w:r>
+      <w:proofErr w:type="spellStart"/>
+      <w:r>
+        <w:t>out_features</w:t>
+      </w:r>
+      <w:proofErr w:type="spellEnd"/>
+      <w:r>
+        <w:t>):</w:t>
+      </w:r>
+      <w:r>
+        <w:br/>
+        <w:t xml:space="preserve">        super().__</w:t>
+      </w:r>
+      <w:proofErr w:type="spellStart"/>
+      <w:r>
+        <w:t>init</w:t>
+      </w:r>
+      <w:proofErr w:type="spellEnd"/>
+      <w:r>
+        <w:t>__()</w:t>
+      </w:r>
+      <w:r>
+        <w:br/>
+      </w:r>
+      <w:r>
+        <w:br/>
+        <w:t xml:space="preserve">        </w:t>
+      </w:r>
+      <w:proofErr w:type="spellStart"/>
+      <w:r>
+        <w:t>self.weight</w:t>
+      </w:r>
+      <w:proofErr w:type="spellEnd"/>
+      <w:r>
+        <w:t xml:space="preserve"> = </w:t>
+      </w:r>
+      <w:proofErr w:type="spellStart"/>
+      <w:r>
+        <w:t>nn.Parameter</w:t>
+      </w:r>
+      <w:proofErr w:type="spellEnd"/>
+      <w:r>
+        <w:t>(</w:t>
+      </w:r>
+      <w:proofErr w:type="spellStart"/>
+      <w:r>
+        <w:t>torch.randn</w:t>
+      </w:r>
+      <w:proofErr w:type="spellEnd"/>
+      <w:r>
+        <w:t>(</w:t>
+      </w:r>
+      <w:proofErr w:type="spellStart"/>
+      <w:r>
+        <w:t>out_features</w:t>
+      </w:r>
+      <w:proofErr w:type="spellEnd"/>
+      <w:r>
+        <w:t xml:space="preserve">, </w:t>
+      </w:r>
+      <w:proofErr w:type="spellStart"/>
+      <w:r>
+        <w:t>in_features</w:t>
+      </w:r>
+      <w:proofErr w:type="spellEnd"/>
+      <w:r>
+        <w:t>) * 0.01)</w:t>
+      </w:r>
+      <w:r>
+        <w:br/>
+      </w:r>
+      <w:r>
+        <w:lastRenderedPageBreak/>
+        <w:t xml:space="preserve">        </w:t>
+      </w:r>
+      <w:proofErr w:type="spellStart"/>
+      <w:r>
+        <w:t>self.bias</w:t>
+      </w:r>
+      <w:proofErr w:type="spellEnd"/>
+      <w:r>
+        <w:t xml:space="preserve"> = </w:t>
+      </w:r>
+      <w:proofErr w:type="spellStart"/>
+      <w:r>
+        <w:t>nn.Parameter</w:t>
+      </w:r>
+      <w:proofErr w:type="spellEnd"/>
+      <w:r>
+        <w:t>(</w:t>
+      </w:r>
+      <w:proofErr w:type="spellStart"/>
+      <w:r>
+        <w:t>torch.zeros</w:t>
+      </w:r>
+      <w:proofErr w:type="spellEnd"/>
+      <w:r>
+        <w:t>(</w:t>
+      </w:r>
+      <w:proofErr w:type="spellStart"/>
+      <w:r>
+        <w:t>out_features</w:t>
+      </w:r>
+      <w:proofErr w:type="spellEnd"/>
+      <w:r>
+        <w:t>))</w:t>
+      </w:r>
+      <w:r>
+        <w:br/>
+      </w:r>
+      <w:r>
+        <w:br/>
+        <w:t xml:space="preserve">        # Gate scores (same shape as weights)</w:t>
+      </w:r>
+      <w:r>
+        <w:br/>
+        <w:t xml:space="preserve">        </w:t>
+      </w:r>
+      <w:proofErr w:type="spellStart"/>
+      <w:r>
+        <w:t>self.gate_scores</w:t>
+      </w:r>
+      <w:proofErr w:type="spellEnd"/>
+      <w:r>
+        <w:t xml:space="preserve"> = </w:t>
+      </w:r>
+      <w:proofErr w:type="spellStart"/>
+      <w:r>
+        <w:t>nn.Parameter</w:t>
+      </w:r>
+      <w:proofErr w:type="spellEnd"/>
+      <w:r>
+        <w:t>(</w:t>
+      </w:r>
+      <w:proofErr w:type="spellStart"/>
+      <w:r>
+        <w:t>torch.randn</w:t>
+      </w:r>
+      <w:proofErr w:type="spellEnd"/>
+      <w:r>
+        <w:t>(</w:t>
+      </w:r>
+      <w:proofErr w:type="spellStart"/>
+      <w:r>
+        <w:t>out_features</w:t>
+      </w:r>
+      <w:proofErr w:type="spellEnd"/>
+      <w:r>
+        <w:t xml:space="preserve">, </w:t>
+      </w:r>
+      <w:proofErr w:type="spellStart"/>
+      <w:r>
+        <w:t>in_features</w:t>
+      </w:r>
+      <w:proofErr w:type="spellEnd"/>
+      <w:r>
+        <w:t>) - 2)</w:t>
+      </w:r>
+      <w:r>
+        <w:br/>
+      </w:r>
+      <w:r>
+        <w:br/>
+        <w:t xml:space="preserve">    def forward(self, x):</w:t>
+      </w:r>
+      <w:r>
+        <w:br/>
+        <w:t xml:space="preserve">        gates = </w:t>
+      </w:r>
+      <w:proofErr w:type="spellStart"/>
+      <w:r>
+        <w:t>torch.sigmoid</w:t>
+      </w:r>
+      <w:proofErr w:type="spellEnd"/>
+      <w:r>
+        <w:t xml:space="preserve">(10 * </w:t>
+      </w:r>
+      <w:proofErr w:type="spellStart"/>
+      <w:r>
+        <w:t>self.gate_scores</w:t>
+      </w:r>
+      <w:proofErr w:type="spellEnd"/>
+      <w:r>
+        <w:t>)</w:t>
+      </w:r>
+      <w:r>
+        <w:br/>
+        <w:t xml:space="preserve">        </w:t>
+      </w:r>
+      <w:proofErr w:type="spellStart"/>
+      <w:r>
+        <w:t>pruned_weights</w:t>
+      </w:r>
+      <w:proofErr w:type="spellEnd"/>
+      <w:r>
+        <w:t xml:space="preserve"> = </w:t>
+      </w:r>
+      <w:proofErr w:type="spellStart"/>
+      <w:r>
+        <w:t>self.weight</w:t>
+      </w:r>
+      <w:proofErr w:type="spellEnd"/>
+      <w:r>
+        <w:t xml:space="preserve"> * gates</w:t>
+      </w:r>
+      <w:r>
+        <w:br/>
+        <w:t xml:space="preserve">        return </w:t>
+      </w:r>
+      <w:proofErr w:type="spellStart"/>
+      <w:r>
+        <w:t>torch.matmul</w:t>
+      </w:r>
+      <w:proofErr w:type="spellEnd"/>
+      <w:r>
+        <w:t xml:space="preserve">(x, pruned_weights.t()) + </w:t>
+      </w:r>
+      <w:proofErr w:type="spellStart"/>
+      <w:r>
+        <w:t>self.bias</w:t>
+      </w:r>
+      <w:proofErr w:type="spellEnd"/>
+      <w:r>
+        <w:br/>
+      </w:r>
+      <w:r>
+        <w:br/>
+        <w:t xml:space="preserve">    def </w:t>
+      </w:r>
+      <w:proofErr w:type="spellStart"/>
+      <w:r>
+        <w:t>get_gate_values</w:t>
+      </w:r>
+      <w:proofErr w:type="spellEnd"/>
+      <w:r>
+        <w:t>(self):</w:t>
+      </w:r>
+      <w:r>
+        <w:br/>
+        <w:t xml:space="preserve">        return </w:t>
+      </w:r>
+      <w:proofErr w:type="spellStart"/>
+      <w:r>
+        <w:t>torch.sigmoid</w:t>
+      </w:r>
+      <w:proofErr w:type="spellEnd"/>
+      <w:r>
+        <w:t>(</w:t>
+      </w:r>
+      <w:proofErr w:type="spellStart"/>
+      <w:r>
+        <w:t>self.gate_scores</w:t>
+      </w:r>
+      <w:proofErr w:type="spellEnd"/>
+      <w:r>
+        <w:t>)</w:t>
+      </w:r>
+      <w:r>
+        <w:br/>
+      </w:r>
+      <w:r>
+        <w:br/>
+      </w:r>
+      <w:r>
+        <w:br/>
+        <w:t># =========================</w:t>
+      </w:r>
+      <w:r>
+        <w:br/>
+        <w:t># 2. MODEL</w:t>
+      </w:r>
+      <w:r>
+        <w:br/>
+        <w:t># =========================</w:t>
+      </w:r>
+      <w:r>
+        <w:br/>
+        <w:t xml:space="preserve">class </w:t>
+      </w:r>
+      <w:proofErr w:type="spellStart"/>
+      <w:r>
+        <w:t>PrunableNN</w:t>
+      </w:r>
+      <w:proofErr w:type="spellEnd"/>
+      <w:r>
+        <w:t>(</w:t>
+      </w:r>
+      <w:proofErr w:type="spellStart"/>
+      <w:r>
+        <w:t>nn.Module</w:t>
+      </w:r>
+      <w:proofErr w:type="spellEnd"/>
+      <w:r>
+        <w:t>):</w:t>
+      </w:r>
+      <w:r>
+        <w:br/>
+        <w:t xml:space="preserve">    def __</w:t>
+      </w:r>
+      <w:proofErr w:type="spellStart"/>
+      <w:r>
+        <w:t>init</w:t>
+      </w:r>
+      <w:proofErr w:type="spellEnd"/>
+      <w:r>
+        <w:t>__(self):</w:t>
+      </w:r>
+      <w:r>
+        <w:br/>
+        <w:t xml:space="preserve">        super().__</w:t>
+      </w:r>
+      <w:proofErr w:type="spellStart"/>
+      <w:r>
+        <w:t>init</w:t>
+      </w:r>
+      <w:proofErr w:type="spellEnd"/>
+      <w:r>
+        <w:t>__()</w:t>
+      </w:r>
+      <w:r>
+        <w:br/>
+      </w:r>
+      <w:r>
+        <w:br/>
+        <w:t xml:space="preserve">        self.fc1 = </w:t>
+      </w:r>
+      <w:proofErr w:type="spellStart"/>
+      <w:r>
+        <w:t>PrunableLinear</w:t>
+      </w:r>
+      <w:proofErr w:type="spellEnd"/>
+      <w:r>
+        <w:t>(32 * 32 * 3, 512)</w:t>
+      </w:r>
+      <w:r>
+        <w:br/>
+        <w:t xml:space="preserve">        self.fc2 = </w:t>
+      </w:r>
+      <w:proofErr w:type="spellStart"/>
+      <w:r>
+        <w:t>PrunableLinear</w:t>
+      </w:r>
+      <w:proofErr w:type="spellEnd"/>
+      <w:r>
+        <w:t>(512, 256)</w:t>
+      </w:r>
+      <w:r>
+        <w:br/>
+        <w:t xml:space="preserve">        self.fc3 = </w:t>
+      </w:r>
+      <w:proofErr w:type="spellStart"/>
+      <w:r>
+        <w:t>PrunableLinear</w:t>
+      </w:r>
+      <w:proofErr w:type="spellEnd"/>
+      <w:r>
+        <w:t>(256, 10)</w:t>
+      </w:r>
+      <w:r>
+        <w:br/>
+      </w:r>
+      <w:r>
+        <w:br/>
+        <w:t xml:space="preserve">        </w:t>
+      </w:r>
+      <w:proofErr w:type="spellStart"/>
+      <w:r>
+        <w:t>self.relu</w:t>
+      </w:r>
+      <w:proofErr w:type="spellEnd"/>
+      <w:r>
+        <w:t xml:space="preserve"> = </w:t>
+      </w:r>
+      <w:proofErr w:type="spellStart"/>
+      <w:r>
+        <w:t>nn.ReLU</w:t>
+      </w:r>
+      <w:proofErr w:type="spellEnd"/>
+      <w:r>
+        <w:t>()</w:t>
+      </w:r>
+      <w:r>
+        <w:br/>
+      </w:r>
+      <w:r>
+        <w:br/>
+        <w:t xml:space="preserve">    def forward(self, x):</w:t>
+      </w:r>
+      <w:r>
+        <w:br/>
+        <w:t xml:space="preserve">        x = </w:t>
+      </w:r>
+      <w:proofErr w:type="spellStart"/>
+      <w:r>
+        <w:t>x.view</w:t>
+      </w:r>
+      <w:proofErr w:type="spellEnd"/>
+      <w:r>
+        <w:t>(</w:t>
+      </w:r>
+      <w:proofErr w:type="spellStart"/>
+      <w:r>
+        <w:t>x.size</w:t>
+      </w:r>
+      <w:proofErr w:type="spellEnd"/>
+      <w:r>
+        <w:t>(0), -1)</w:t>
+      </w:r>
+      <w:r>
+        <w:br/>
+      </w:r>
+      <w:r>
+        <w:br/>
+        <w:t xml:space="preserve">        x = </w:t>
+      </w:r>
+      <w:proofErr w:type="spellStart"/>
+      <w:r>
+        <w:t>self.relu</w:t>
+      </w:r>
+      <w:proofErr w:type="spellEnd"/>
+      <w:r>
+        <w:t>(self.fc1(x))</w:t>
+      </w:r>
+      <w:r>
+        <w:br/>
+        <w:t xml:space="preserve">        x = </w:t>
+      </w:r>
+      <w:proofErr w:type="spellStart"/>
+      <w:r>
+        <w:t>self.relu</w:t>
+      </w:r>
+      <w:proofErr w:type="spellEnd"/>
+      <w:r>
+        <w:t>(self.fc2(x))</w:t>
+      </w:r>
+      <w:r>
+        <w:br/>
+        <w:t xml:space="preserve">        x = self.fc3(x)</w:t>
+      </w:r>
+      <w:r>
+        <w:br/>
+      </w:r>
+      <w:r>
+        <w:br/>
+        <w:t xml:space="preserve">        return x</w:t>
+      </w:r>
+      <w:r>
+        <w:br/>
+      </w:r>
+      <w:r>
+        <w:br/>
+        <w:t xml:space="preserve">    def </w:t>
+      </w:r>
+      <w:proofErr w:type="spellStart"/>
+      <w:r>
+        <w:t>get_all_gates</w:t>
+      </w:r>
+      <w:proofErr w:type="spellEnd"/>
+      <w:r>
+        <w:t>(self):</w:t>
+      </w:r>
+      <w:r>
+        <w:br/>
+        <w:t xml:space="preserve">        gates = []</w:t>
+      </w:r>
+      <w:r>
+        <w:br/>
+        <w:t xml:space="preserve">        for layer in [self.fc1, self.fc2, self.fc3]:</w:t>
+      </w:r>
+      <w:r>
+        <w:br/>
+        <w:t xml:space="preserve">            </w:t>
+      </w:r>
+      <w:proofErr w:type="spellStart"/>
+      <w:r>
+        <w:t>gates.append</w:t>
+      </w:r>
+      <w:proofErr w:type="spellEnd"/>
+      <w:r>
+        <w:t>(</w:t>
+      </w:r>
+      <w:proofErr w:type="spellStart"/>
+      <w:r>
+        <w:t>layer.get_gate_values</w:t>
+      </w:r>
+      <w:proofErr w:type="spellEnd"/>
+      <w:r>
+        <w:t>().view(-1))</w:t>
+      </w:r>
+      <w:r>
+        <w:br/>
+        <w:t xml:space="preserve">        return torch.cat(gates)</w:t>
+      </w:r>
+      <w:r>
+        <w:br/>
+      </w:r>
+      <w:r>
+        <w:br/>
+      </w:r>
+      <w:r>
+        <w:br/>
+      </w:r>
+      <w:r>
+        <w:lastRenderedPageBreak/>
+        <w:t># =========================</w:t>
+      </w:r>
+      <w:r>
+        <w:br/>
+        <w:t># 3. DATA</w:t>
+      </w:r>
+      <w:r>
+        <w:br/>
+        <w:t># =========================</w:t>
+      </w:r>
+      <w:r>
+        <w:br/>
+        <w:t xml:space="preserve">def </w:t>
+      </w:r>
+      <w:proofErr w:type="spellStart"/>
+      <w:r>
+        <w:t>load_data</w:t>
+      </w:r>
+      <w:proofErr w:type="spellEnd"/>
+      <w:r>
+        <w:t>():</w:t>
+      </w:r>
+      <w:r>
+        <w:br/>
+        <w:t xml:space="preserve">    transform = </w:t>
+      </w:r>
+      <w:proofErr w:type="spellStart"/>
+      <w:r>
+        <w:t>transforms.Compose</w:t>
+      </w:r>
+      <w:proofErr w:type="spellEnd"/>
+      <w:r>
+        <w:t>([</w:t>
+      </w:r>
+      <w:r>
+        <w:br/>
+        <w:t xml:space="preserve">        </w:t>
+      </w:r>
+      <w:proofErr w:type="spellStart"/>
+      <w:r>
+        <w:t>transforms.ToTensor</w:t>
+      </w:r>
+      <w:proofErr w:type="spellEnd"/>
+      <w:r>
+        <w:t>(),</w:t>
+      </w:r>
+      <w:r>
+        <w:br/>
+        <w:t xml:space="preserve">        </w:t>
+      </w:r>
+      <w:proofErr w:type="spellStart"/>
+      <w:r>
+        <w:t>transforms.Normalize</w:t>
+      </w:r>
+      <w:proofErr w:type="spellEnd"/>
+      <w:r>
+        <w:t>((0.5,), (0.5,))</w:t>
+      </w:r>
+      <w:r>
+        <w:br/>
+        <w:t xml:space="preserve">    ])</w:t>
+      </w:r>
+      <w:r>
+        <w:br/>
+      </w:r>
+      <w:r>
+        <w:br/>
+        <w:t xml:space="preserve">    trainset = torchvision.datasets.CIFAR10(</w:t>
+      </w:r>
+      <w:r>
+        <w:br/>
+        <w:t xml:space="preserve">        root='./data', train=True, download=True, transform=transform)</w:t>
+      </w:r>
+      <w:r>
+        <w:br/>
+      </w:r>
+      <w:r>
+        <w:br/>
+        <w:t xml:space="preserve">    </w:t>
+      </w:r>
+      <w:proofErr w:type="spellStart"/>
+      <w:r>
+        <w:t>testset</w:t>
+      </w:r>
+      <w:proofErr w:type="spellEnd"/>
+      <w:r>
+        <w:t xml:space="preserve"> = torchvision.datasets.CIFAR10(</w:t>
+      </w:r>
+      <w:r>
+        <w:br/>
+        <w:t xml:space="preserve">        root='./data', train=False, download=True, transform=transform)</w:t>
+      </w:r>
+      <w:r>
+        <w:br/>
+      </w:r>
+      <w:r>
+        <w:br/>
+        <w:t xml:space="preserve">    </w:t>
+      </w:r>
+      <w:proofErr w:type="spellStart"/>
+      <w:r>
+        <w:t>trainloader</w:t>
+      </w:r>
+      <w:proofErr w:type="spellEnd"/>
+      <w:r>
+        <w:t xml:space="preserve"> = </w:t>
+      </w:r>
+      <w:proofErr w:type="spellStart"/>
+      <w:r>
+        <w:t>torch.utils.data.DataLoader</w:t>
+      </w:r>
+      <w:proofErr w:type="spellEnd"/>
+      <w:r>
+        <w:t xml:space="preserve">(trainset, </w:t>
+      </w:r>
+      <w:proofErr w:type="spellStart"/>
+      <w:r>
+        <w:t>batch_size</w:t>
+      </w:r>
+      <w:proofErr w:type="spellEnd"/>
+      <w:r>
+        <w:t>=128, shuffle=True)</w:t>
+      </w:r>
+      <w:r>
+        <w:br/>
+        <w:t xml:space="preserve">    </w:t>
+      </w:r>
+      <w:proofErr w:type="spellStart"/>
+      <w:r>
+        <w:t>testloader</w:t>
+      </w:r>
+      <w:proofErr w:type="spellEnd"/>
+      <w:r>
+        <w:t xml:space="preserve"> = </w:t>
+      </w:r>
+      <w:proofErr w:type="spellStart"/>
+      <w:r>
+        <w:t>torch.utils.data.DataLoader</w:t>
+      </w:r>
+      <w:proofErr w:type="spellEnd"/>
+      <w:r>
+        <w:t>(</w:t>
+      </w:r>
+      <w:proofErr w:type="spellStart"/>
+      <w:r>
+        <w:t>testset</w:t>
+      </w:r>
+      <w:proofErr w:type="spellEnd"/>
+      <w:r>
+        <w:t xml:space="preserve">, </w:t>
+      </w:r>
+      <w:proofErr w:type="spellStart"/>
+      <w:r>
+        <w:t>batch_size</w:t>
+      </w:r>
+      <w:proofErr w:type="spellEnd"/>
+      <w:r>
+        <w:t>=128, shuffle=False)</w:t>
+      </w:r>
+      <w:r>
+        <w:br/>
+      </w:r>
+      <w:r>
+        <w:br/>
+        <w:t xml:space="preserve">    return </w:t>
+      </w:r>
+      <w:proofErr w:type="spellStart"/>
+      <w:r>
+        <w:t>trainloader</w:t>
+      </w:r>
+      <w:proofErr w:type="spellEnd"/>
+      <w:r>
+        <w:t xml:space="preserve">, </w:t>
+      </w:r>
+      <w:proofErr w:type="spellStart"/>
+      <w:r>
+        <w:t>testloader</w:t>
+      </w:r>
+      <w:proofErr w:type="spellEnd"/>
+      <w:r>
+        <w:br/>
+      </w:r>
+      <w:r>
+        <w:br/>
+      </w:r>
+      <w:r>
+        <w:br/>
+        <w:t># =========================</w:t>
+      </w:r>
+      <w:r>
+        <w:br/>
+        <w:t># 4. SPARSITY LOSS</w:t>
+      </w:r>
+      <w:r>
+        <w:br/>
+        <w:t># =========================</w:t>
+      </w:r>
+      <w:r>
+        <w:br/>
+        <w:t xml:space="preserve">def </w:t>
+      </w:r>
+      <w:proofErr w:type="spellStart"/>
+      <w:r>
+        <w:t>sparsity_loss</w:t>
+      </w:r>
+      <w:proofErr w:type="spellEnd"/>
+      <w:r>
+        <w:t>(model):</w:t>
+      </w:r>
+      <w:r>
+        <w:br/>
+        <w:t xml:space="preserve">    gates = </w:t>
+      </w:r>
+      <w:proofErr w:type="spellStart"/>
+      <w:r>
+        <w:t>model.get_all_</w:t>
+      </w:r>
+      <w:proofErr w:type="gramStart"/>
+      <w:r>
+        <w:t>gates</w:t>
+      </w:r>
+      <w:proofErr w:type="spellEnd"/>
+      <w:r>
+        <w:t>(</w:t>
+      </w:r>
+      <w:proofErr w:type="gramEnd"/>
+      <w:r>
+        <w:t>)</w:t>
+      </w:r>
+      <w:r>
+        <w:br/>
+        <w:t xml:space="preserve">    return </w:t>
+      </w:r>
+      <w:proofErr w:type="spellStart"/>
+      <w:r>
+        <w:t>torch.mean</w:t>
+      </w:r>
+      <w:proofErr w:type="spellEnd"/>
+      <w:r>
+        <w:t>(</w:t>
+      </w:r>
+      <w:proofErr w:type="spellStart"/>
+      <w:r>
+        <w:t>torch.abs</w:t>
+      </w:r>
+      <w:proofErr w:type="spellEnd"/>
+      <w:r>
+        <w:t>(gates))</w:t>
+      </w:r>
+      <w:r>
+        <w:br/>
+      </w:r>
+      <w:r>
+        <w:br/>
+      </w:r>
+      <w:r>
+        <w:br/>
+        <w:t># =========================</w:t>
+      </w:r>
+      <w:r>
+        <w:br/>
+        <w:t># 5. TRAINING</w:t>
+      </w:r>
+      <w:r>
+        <w:br/>
+        <w:t># =========================</w:t>
+      </w:r>
+      <w:r>
+        <w:br/>
+        <w:t xml:space="preserve">def </w:t>
+      </w:r>
+      <w:proofErr w:type="spellStart"/>
+      <w:r>
+        <w:t>train_model</w:t>
+      </w:r>
+      <w:proofErr w:type="spellEnd"/>
+      <w:r>
+        <w:t>(</w:t>
+      </w:r>
+      <w:proofErr w:type="spellStart"/>
+      <w:r>
+        <w:t>lambda_val</w:t>
+      </w:r>
+      <w:proofErr w:type="spellEnd"/>
+      <w:r>
+        <w:t>, epochs=10):</w:t>
+      </w:r>
+      <w:r>
+        <w:br/>
+        <w:t xml:space="preserve">    model = </w:t>
+      </w:r>
+      <w:proofErr w:type="spellStart"/>
+      <w:r>
+        <w:t>PrunableNN</w:t>
+      </w:r>
+      <w:proofErr w:type="spellEnd"/>
+      <w:r>
+        <w:t>().to(device)</w:t>
+      </w:r>
+      <w:r>
+        <w:br/>
+      </w:r>
+      <w:r>
+        <w:br/>
+        <w:t xml:space="preserve">    </w:t>
+      </w:r>
+      <w:proofErr w:type="spellStart"/>
+      <w:r>
+        <w:t>trainloader</w:t>
+      </w:r>
+      <w:proofErr w:type="spellEnd"/>
+      <w:r>
+        <w:t xml:space="preserve">, </w:t>
+      </w:r>
+      <w:proofErr w:type="spellStart"/>
+      <w:r>
+        <w:t>testloader</w:t>
+      </w:r>
+      <w:proofErr w:type="spellEnd"/>
+      <w:r>
+        <w:t xml:space="preserve"> = </w:t>
+      </w:r>
+      <w:proofErr w:type="spellStart"/>
+      <w:r>
+        <w:t>load_data</w:t>
+      </w:r>
+      <w:proofErr w:type="spellEnd"/>
+      <w:r>
+        <w:t>()</w:t>
+      </w:r>
+      <w:r>
+        <w:br/>
+      </w:r>
+      <w:r>
+        <w:br/>
+        <w:t xml:space="preserve">    criterion = </w:t>
+      </w:r>
+      <w:proofErr w:type="spellStart"/>
+      <w:r>
+        <w:t>nn.CrossEntropyLoss</w:t>
+      </w:r>
+      <w:proofErr w:type="spellEnd"/>
+      <w:r>
+        <w:t>()</w:t>
+      </w:r>
+      <w:r>
+        <w:br/>
+        <w:t xml:space="preserve">    optimizer = </w:t>
+      </w:r>
+      <w:proofErr w:type="spellStart"/>
+      <w:r>
+        <w:t>optim.Adam</w:t>
+      </w:r>
+      <w:proofErr w:type="spellEnd"/>
+      <w:r>
+        <w:t>(</w:t>
+      </w:r>
+      <w:proofErr w:type="spellStart"/>
+      <w:r>
+        <w:t>model.parameters</w:t>
+      </w:r>
+      <w:proofErr w:type="spellEnd"/>
+      <w:r>
+        <w:t xml:space="preserve">(), </w:t>
+      </w:r>
+      <w:proofErr w:type="spellStart"/>
+      <w:r>
+        <w:t>lr</w:t>
+      </w:r>
+      <w:proofErr w:type="spellEnd"/>
+      <w:r>
+        <w:t>=0.001)</w:t>
+      </w:r>
+      <w:r>
+        <w:br/>
+      </w:r>
+      <w:r>
+        <w:br/>
+        <w:t xml:space="preserve">    for epoch in range(epochs):</w:t>
+      </w:r>
+      <w:r>
+        <w:br/>
+        <w:t xml:space="preserve">        </w:t>
+      </w:r>
+      <w:proofErr w:type="spellStart"/>
+      <w:r>
+        <w:t>model.train</w:t>
+      </w:r>
+      <w:proofErr w:type="spellEnd"/>
+      <w:r>
+        <w:t>()</w:t>
+      </w:r>
+      <w:r>
+        <w:br/>
+        <w:t xml:space="preserve">        </w:t>
+      </w:r>
+      <w:proofErr w:type="spellStart"/>
+      <w:r>
+        <w:t>total_loss</w:t>
+      </w:r>
+      <w:proofErr w:type="spellEnd"/>
+      <w:r>
+        <w:t xml:space="preserve"> = 0</w:t>
+      </w:r>
+      <w:r>
+        <w:br/>
+      </w:r>
+      <w:r>
+        <w:lastRenderedPageBreak/>
+        <w:br/>
+        <w:t xml:space="preserve">        for inputs, labels in </w:t>
+      </w:r>
+      <w:proofErr w:type="spellStart"/>
+      <w:r>
+        <w:t>trainloader</w:t>
+      </w:r>
+      <w:proofErr w:type="spellEnd"/>
+      <w:r>
+        <w:t>:</w:t>
+      </w:r>
+      <w:r>
+        <w:br/>
+        <w:t xml:space="preserve">            inputs, labels = inputs.to(device), labels.to(device)</w:t>
+      </w:r>
+      <w:r>
+        <w:br/>
+      </w:r>
+      <w:r>
+        <w:br/>
+        <w:t xml:space="preserve">            </w:t>
+      </w:r>
+      <w:proofErr w:type="spellStart"/>
+      <w:r>
+        <w:t>optimizer.zero_grad</w:t>
+      </w:r>
+      <w:proofErr w:type="spellEnd"/>
+      <w:r>
+        <w:t>()</w:t>
+      </w:r>
+      <w:r>
+        <w:br/>
+      </w:r>
+      <w:r>
+        <w:br/>
+        <w:t xml:space="preserve">            outputs = model(inputs)</w:t>
+      </w:r>
+      <w:r>
+        <w:br/>
+      </w:r>
+      <w:r>
+        <w:br/>
+        <w:t xml:space="preserve">            </w:t>
+      </w:r>
+      <w:proofErr w:type="spellStart"/>
+      <w:r>
+        <w:t>cls_loss</w:t>
+      </w:r>
+      <w:proofErr w:type="spellEnd"/>
+      <w:r>
+        <w:t xml:space="preserve"> = criterion(outputs, labels)</w:t>
+      </w:r>
+      <w:r>
+        <w:br/>
+        <w:t xml:space="preserve">            </w:t>
+      </w:r>
+      <w:proofErr w:type="spellStart"/>
+      <w:r>
+        <w:t>sp_loss</w:t>
+      </w:r>
+      <w:proofErr w:type="spellEnd"/>
+      <w:r>
+        <w:t xml:space="preserve"> = </w:t>
+      </w:r>
+      <w:proofErr w:type="spellStart"/>
+      <w:r>
+        <w:t>sparsity_loss</w:t>
+      </w:r>
+      <w:proofErr w:type="spellEnd"/>
+      <w:r>
+        <w:t>(model)</w:t>
+      </w:r>
+      <w:r>
+        <w:br/>
+      </w:r>
+      <w:r>
+        <w:br/>
+        <w:t xml:space="preserve">            loss = </w:t>
+      </w:r>
+      <w:proofErr w:type="spellStart"/>
+      <w:r>
+        <w:t>cls_loss</w:t>
+      </w:r>
+      <w:proofErr w:type="spellEnd"/>
+      <w:r>
+        <w:t xml:space="preserve"> + </w:t>
+      </w:r>
+      <w:proofErr w:type="spellStart"/>
+      <w:r>
+        <w:t>lambda_val</w:t>
+      </w:r>
+      <w:proofErr w:type="spellEnd"/>
+      <w:r>
+        <w:t xml:space="preserve"> * </w:t>
+      </w:r>
+      <w:proofErr w:type="spellStart"/>
+      <w:r>
+        <w:t>sp_loss</w:t>
+      </w:r>
+      <w:proofErr w:type="spellEnd"/>
+      <w:r>
+        <w:br/>
+      </w:r>
+      <w:r>
+        <w:br/>
+        <w:t xml:space="preserve">            </w:t>
+      </w:r>
+      <w:proofErr w:type="spellStart"/>
+      <w:r>
+        <w:t>loss.backward</w:t>
+      </w:r>
+      <w:proofErr w:type="spellEnd"/>
+      <w:r>
+        <w:t>()</w:t>
+      </w:r>
+      <w:r>
+        <w:br/>
+        <w:t xml:space="preserve">            </w:t>
+      </w:r>
+      <w:proofErr w:type="spellStart"/>
+      <w:r>
+        <w:t>optimizer.step</w:t>
+      </w:r>
+      <w:proofErr w:type="spellEnd"/>
+      <w:r>
+        <w:t>()</w:t>
+      </w:r>
+      <w:r>
+        <w:br/>
+      </w:r>
+      <w:r>
+        <w:br/>
+        <w:t xml:space="preserve">            </w:t>
+      </w:r>
+      <w:proofErr w:type="spellStart"/>
+      <w:r>
+        <w:t>total_loss</w:t>
+      </w:r>
+      <w:proofErr w:type="spellEnd"/>
+      <w:r>
+        <w:t xml:space="preserve"> += </w:t>
+      </w:r>
+      <w:proofErr w:type="spellStart"/>
+      <w:r>
+        <w:t>loss.item</w:t>
+      </w:r>
+      <w:proofErr w:type="spellEnd"/>
+      <w:r>
+        <w:t>()</w:t>
+      </w:r>
+      <w:r>
+        <w:br/>
+      </w:r>
+      <w:r>
+        <w:br/>
+        <w:t xml:space="preserve">        print(</w:t>
+      </w:r>
+      <w:proofErr w:type="spellStart"/>
+      <w:r>
+        <w:t>f"Epoch</w:t>
+      </w:r>
+      <w:proofErr w:type="spellEnd"/>
+      <w:r>
+        <w:t xml:space="preserve"> {epoch+1}/{epochs}, Loss: {total_loss:.4f}")</w:t>
+      </w:r>
+      <w:r>
+        <w:br/>
+      </w:r>
+      <w:r>
+        <w:br/>
+        <w:t xml:space="preserve">    acc = evaluate(model, </w:t>
+      </w:r>
+      <w:proofErr w:type="spellStart"/>
+      <w:r>
+        <w:t>testloader</w:t>
+      </w:r>
+      <w:proofErr w:type="spellEnd"/>
+      <w:r>
+        <w:t>)</w:t>
+      </w:r>
+      <w:r>
+        <w:br/>
+        <w:t xml:space="preserve">    sparsity = </w:t>
+      </w:r>
+      <w:proofErr w:type="spellStart"/>
+      <w:r>
+        <w:t>calculate_sparsity</w:t>
+      </w:r>
+      <w:proofErr w:type="spellEnd"/>
+      <w:r>
+        <w:t>(model)</w:t>
+      </w:r>
+      <w:r>
+        <w:br/>
+      </w:r>
+      <w:r>
+        <w:br/>
+        <w:t xml:space="preserve">    return model, acc, sparsity</w:t>
+      </w:r>
+      <w:r>
+        <w:br/>
+      </w:r>
+      <w:r>
+        <w:br/>
+      </w:r>
+      <w:r>
+        <w:br/>
+        <w:t># =========================</w:t>
+      </w:r>
+      <w:r>
+        <w:br/>
+        <w:t># 6. EVALUATION</w:t>
+      </w:r>
+      <w:r>
+        <w:br/>
+        <w:t># =========================</w:t>
+      </w:r>
+      <w:r>
+        <w:br/>
+        <w:t xml:space="preserve">def evaluate(model, </w:t>
+      </w:r>
+      <w:proofErr w:type="spellStart"/>
+      <w:r>
+        <w:t>testloader</w:t>
+      </w:r>
+      <w:proofErr w:type="spellEnd"/>
+      <w:r>
+        <w:t>):</w:t>
+      </w:r>
+      <w:r>
+        <w:br/>
+        <w:t xml:space="preserve">    </w:t>
+      </w:r>
+      <w:proofErr w:type="spellStart"/>
+      <w:r>
+        <w:t>model.eval</w:t>
+      </w:r>
+      <w:proofErr w:type="spellEnd"/>
+      <w:r>
+        <w:t>()</w:t>
+      </w:r>
+      <w:r>
+        <w:br/>
+        <w:t xml:space="preserve">    correct = 0</w:t>
+      </w:r>
+      <w:r>
+        <w:br/>
+        <w:t xml:space="preserve">    total = 0</w:t>
+      </w:r>
+      <w:r>
+        <w:br/>
+      </w:r>
+      <w:r>
+        <w:br/>
+        <w:t xml:space="preserve">    with </w:t>
+      </w:r>
+      <w:proofErr w:type="spellStart"/>
+      <w:r>
+        <w:t>torch.no_grad</w:t>
+      </w:r>
+      <w:proofErr w:type="spellEnd"/>
+      <w:r>
+        <w:t>():</w:t>
+      </w:r>
+      <w:r>
+        <w:br/>
+        <w:t xml:space="preserve">        for inputs, labels in </w:t>
+      </w:r>
+      <w:proofErr w:type="spellStart"/>
+      <w:r>
+        <w:t>testloader</w:t>
+      </w:r>
+      <w:proofErr w:type="spellEnd"/>
+      <w:r>
+        <w:t>:</w:t>
+      </w:r>
+      <w:r>
+        <w:br/>
+        <w:t xml:space="preserve">            inputs, labels = inputs.to(device), labels.to(device)</w:t>
+      </w:r>
+      <w:r>
+        <w:br/>
+      </w:r>
+      <w:r>
+        <w:br/>
+        <w:t xml:space="preserve">            outputs = model(inputs)</w:t>
+      </w:r>
+      <w:r>
+        <w:br/>
+        <w:t xml:space="preserve">            _, predicted = </w:t>
+      </w:r>
+      <w:proofErr w:type="spellStart"/>
+      <w:r>
+        <w:t>torch.max</w:t>
+      </w:r>
+      <w:proofErr w:type="spellEnd"/>
+      <w:r>
+        <w:t>(outputs, 1)</w:t>
+      </w:r>
+      <w:r>
+        <w:br/>
+      </w:r>
+      <w:r>
+        <w:br/>
+        <w:t xml:space="preserve">            total += </w:t>
+      </w:r>
+      <w:proofErr w:type="spellStart"/>
+      <w:r>
+        <w:t>labels.size</w:t>
+      </w:r>
+      <w:proofErr w:type="spellEnd"/>
+      <w:r>
+        <w:t>(0)</w:t>
+      </w:r>
+      <w:r>
+        <w:br/>
+        <w:t xml:space="preserve">            correct += (predicted == labels).sum().item()</w:t>
+      </w:r>
+      <w:r>
+        <w:br/>
+      </w:r>
+      <w:r>
+        <w:lastRenderedPageBreak/>
+        <w:br/>
+        <w:t xml:space="preserve">    accuracy = 100 * correct / total</w:t>
+      </w:r>
+      <w:r>
+        <w:br/>
+        <w:t xml:space="preserve">    print(</w:t>
+      </w:r>
+      <w:proofErr w:type="spellStart"/>
+      <w:r>
+        <w:t>f"Test</w:t>
+      </w:r>
+      <w:proofErr w:type="spellEnd"/>
+      <w:r>
+        <w:t xml:space="preserve"> Accuracy: {accuracy:.2f}%")</w:t>
+      </w:r>
+      <w:r>
+        <w:br/>
+      </w:r>
+      <w:r>
+        <w:br/>
+        <w:t xml:space="preserve">    return accuracy</w:t>
+      </w:r>
+      <w:r>
+        <w:br/>
+      </w:r>
+      <w:r>
+        <w:br/>
+      </w:r>
+      <w:r>
+        <w:br/>
+        <w:t># =========================</w:t>
+      </w:r>
+      <w:r>
+        <w:br/>
+        <w:t># 7. SPARSITY CALCULATION</w:t>
+      </w:r>
+      <w:r>
+        <w:br/>
+        <w:t># =========================</w:t>
+      </w:r>
+      <w:r>
+        <w:br/>
+        <w:t xml:space="preserve">def </w:t>
+      </w:r>
+      <w:proofErr w:type="spellStart"/>
+      <w:r>
+        <w:t>calculate_sparsity</w:t>
+      </w:r>
+      <w:proofErr w:type="spellEnd"/>
+      <w:r>
+        <w:t>(model, threshold=1e-2):</w:t>
+      </w:r>
+      <w:r>
+        <w:br/>
+        <w:t xml:space="preserve">    gates = </w:t>
+      </w:r>
+      <w:proofErr w:type="spellStart"/>
+      <w:r>
+        <w:t>model.get_all_gates</w:t>
+      </w:r>
+      <w:proofErr w:type="spellEnd"/>
+      <w:r>
+        <w:t>().detach().</w:t>
+      </w:r>
+      <w:proofErr w:type="spellStart"/>
+      <w:r>
+        <w:t>cpu</w:t>
+      </w:r>
+      <w:proofErr w:type="spellEnd"/>
+      <w:r>
+        <w:t>().</w:t>
+      </w:r>
+      <w:proofErr w:type="spellStart"/>
+      <w:r>
+        <w:t>numpy</w:t>
+      </w:r>
+      <w:proofErr w:type="spellEnd"/>
+      <w:r>
+        <w:t>()</w:t>
+      </w:r>
+      <w:r>
+        <w:br/>
+      </w:r>
+      <w:r>
+        <w:br/>
+        <w:t xml:space="preserve">    total = </w:t>
+      </w:r>
+      <w:proofErr w:type="spellStart"/>
+      <w:r>
+        <w:t>len</w:t>
+      </w:r>
+      <w:proofErr w:type="spellEnd"/>
+      <w:r>
+        <w:t>(gates)</w:t>
+      </w:r>
+      <w:r>
+        <w:br/>
+        <w:t xml:space="preserve">    pruned = </w:t>
+      </w:r>
+      <w:proofErr w:type="spellStart"/>
+      <w:r>
+        <w:t>np.sum</w:t>
+      </w:r>
+      <w:proofErr w:type="spellEnd"/>
+      <w:r>
+        <w:t>(gates &lt; threshold)</w:t>
+      </w:r>
+      <w:r>
+        <w:br/>
+      </w:r>
+      <w:r>
+        <w:br/>
+        <w:t xml:space="preserve">    sparsity = (pruned / total) * 100</w:t>
+      </w:r>
+      <w:r>
+        <w:br/>
+        <w:t xml:space="preserve">    print(</w:t>
+      </w:r>
+      <w:proofErr w:type="spellStart"/>
+      <w:r>
+        <w:t>f"Sparsity</w:t>
+      </w:r>
+      <w:proofErr w:type="spellEnd"/>
+      <w:r>
+        <w:t>: {sparsity:.2f}%")</w:t>
+      </w:r>
+      <w:r>
+        <w:br/>
+      </w:r>
+      <w:r>
+        <w:br/>
+        <w:t xml:space="preserve">    return sparsity</w:t>
+      </w:r>
+      <w:r>
+        <w:br/>
+      </w:r>
+      <w:r>
+        <w:br/>
+      </w:r>
+      <w:r>
+        <w:br/>
+        <w:t># =========================</w:t>
+      </w:r>
+      <w:r>
+        <w:br/>
+        <w:t># 8. PLOT</w:t>
+      </w:r>
+      <w:r>
+        <w:br/>
+        <w:t># =========================</w:t>
+      </w:r>
+      <w:r>
+        <w:br/>
+        <w:t xml:space="preserve">def </w:t>
+      </w:r>
+      <w:proofErr w:type="spellStart"/>
+      <w:r>
+        <w:t>plot_gates</w:t>
+      </w:r>
+      <w:proofErr w:type="spellEnd"/>
+      <w:r>
+        <w:t>(model):</w:t>
+      </w:r>
+      <w:r>
+        <w:br/>
+        <w:t xml:space="preserve">    gates = </w:t>
+      </w:r>
+      <w:proofErr w:type="spellStart"/>
+      <w:r>
+        <w:t>model.get_all_gates</w:t>
+      </w:r>
+      <w:proofErr w:type="spellEnd"/>
+      <w:r>
+        <w:t>().detach().</w:t>
+      </w:r>
+      <w:proofErr w:type="spellStart"/>
+      <w:r>
+        <w:t>cpu</w:t>
+      </w:r>
+      <w:proofErr w:type="spellEnd"/>
+      <w:r>
+        <w:t>().</w:t>
+      </w:r>
+      <w:proofErr w:type="spellStart"/>
+      <w:r>
+        <w:t>numpy</w:t>
+      </w:r>
+      <w:proofErr w:type="spellEnd"/>
+      <w:r>
+        <w:t>()</w:t>
+      </w:r>
+      <w:r>
+        <w:br/>
+      </w:r>
+      <w:r>
+        <w:br/>
+        <w:t xml:space="preserve">    </w:t>
+      </w:r>
+      <w:proofErr w:type="spellStart"/>
+      <w:r>
+        <w:t>plt.hist</w:t>
+      </w:r>
+      <w:proofErr w:type="spellEnd"/>
+      <w:r>
+        <w:t>(gates, bins=50)</w:t>
+      </w:r>
+      <w:r>
+        <w:br/>
+        <w:t xml:space="preserve">    </w:t>
+      </w:r>
+      <w:proofErr w:type="spellStart"/>
+      <w:r>
+        <w:t>plt.title</w:t>
+      </w:r>
+      <w:proofErr w:type="spellEnd"/>
+      <w:r>
+        <w:t>("Gate Value Distribution")</w:t>
+      </w:r>
+      <w:r>
+        <w:br/>
+        <w:t xml:space="preserve">    </w:t>
+      </w:r>
+      <w:proofErr w:type="spellStart"/>
+      <w:r>
+        <w:t>plt.xlabel</w:t>
+      </w:r>
+      <w:proofErr w:type="spellEnd"/>
+      <w:r>
+        <w:t>("Gate Values")</w:t>
+      </w:r>
+      <w:r>
+        <w:br/>
+        <w:t xml:space="preserve">    </w:t>
+      </w:r>
+      <w:proofErr w:type="spellStart"/>
+      <w:r>
+        <w:t>plt.ylabel</w:t>
+      </w:r>
+      <w:proofErr w:type="spellEnd"/>
+      <w:r>
+        <w:t>("Frequency")</w:t>
+      </w:r>
+      <w:r>
+        <w:br/>
+        <w:t xml:space="preserve">    </w:t>
+      </w:r>
+      <w:proofErr w:type="spellStart"/>
+      <w:r>
+        <w:t>plt.show</w:t>
+      </w:r>
+      <w:proofErr w:type="spellEnd"/>
+      <w:r>
+        <w:t>()</w:t>
+      </w:r>
+      <w:r>
+        <w:br/>
+      </w:r>
+      <w:r>
+        <w:br/>
+      </w:r>
+      <w:r>
+        <w:br/>
+        <w:t># =========================</w:t>
+      </w:r>
+      <w:r>
+        <w:br/>
+        <w:t># 9. MAIN</w:t>
+      </w:r>
+      <w:r>
+        <w:br/>
+        <w:t># =========================</w:t>
+      </w:r>
+      <w:r>
+        <w:br/>
+        <w:t>if __name__ == "__main__":</w:t>
+      </w:r>
+      <w:r>
+        <w:br/>
+        <w:t xml:space="preserve">    </w:t>
+      </w:r>
+      <w:proofErr w:type="spellStart"/>
+      <w:r>
+        <w:t>lambda_values</w:t>
+      </w:r>
+      <w:proofErr w:type="spellEnd"/>
+      <w:r>
+        <w:t xml:space="preserve"> = [0.1, 1, 5]</w:t>
+      </w:r>
+      <w:r>
+        <w:br/>
+      </w:r>
+      <w:r>
+        <w:br/>
+        <w:t xml:space="preserve">    results = []</w:t>
+      </w:r>
+      <w:r>
+        <w:br/>
+      </w:r>
+      <w:r>
+        <w:br/>
+      </w:r>
+      <w:r>
+        <w:lastRenderedPageBreak/>
+        <w:t xml:space="preserve">    for lam in </w:t>
+      </w:r>
+      <w:proofErr w:type="spellStart"/>
+      <w:r>
+        <w:t>lambda_values</w:t>
+      </w:r>
+      <w:proofErr w:type="spellEnd"/>
+      <w:r>
+        <w:t>:</w:t>
+      </w:r>
+      <w:r>
+        <w:br/>
+        <w:t xml:space="preserve">        print(f"\</w:t>
+      </w:r>
+      <w:proofErr w:type="spellStart"/>
+      <w:r>
+        <w:t>nTraining</w:t>
+      </w:r>
+      <w:proofErr w:type="spellEnd"/>
+      <w:r>
+        <w:t xml:space="preserve"> with lambda = {lam}")</w:t>
+      </w:r>
+      <w:r>
+        <w:br/>
+      </w:r>
+      <w:r>
+        <w:br/>
+        <w:t xml:space="preserve">        model, acc, sparsity = </w:t>
+      </w:r>
+      <w:proofErr w:type="spellStart"/>
+      <w:r>
+        <w:t>train_model</w:t>
+      </w:r>
+      <w:proofErr w:type="spellEnd"/>
+      <w:r>
+        <w:t>(lam, epochs=5)</w:t>
+      </w:r>
+      <w:r>
+        <w:br/>
+      </w:r>
+      <w:r>
+        <w:br/>
+        <w:t xml:space="preserve">        </w:t>
+      </w:r>
+      <w:proofErr w:type="spellStart"/>
+      <w:r>
+        <w:t>results.append</w:t>
+      </w:r>
+      <w:proofErr w:type="spellEnd"/>
+      <w:r>
+        <w:t>((lam, acc, sparsity))</w:t>
+      </w:r>
+      <w:r>
+        <w:br/>
+      </w:r>
+      <w:r>
+        <w:br/>
+        <w:t xml:space="preserve">        if lam == 5:</w:t>
+      </w:r>
+      <w:r>
+        <w:br/>
+        <w:t xml:space="preserve">            </w:t>
+      </w:r>
+      <w:proofErr w:type="spellStart"/>
+      <w:r>
+        <w:t>plot_gates</w:t>
+      </w:r>
+      <w:proofErr w:type="spellEnd"/>
+      <w:r>
+        <w:t>(model)</w:t>
+      </w:r>
+      <w:r>
+        <w:br/>
+      </w:r>
+      <w:r>
+        <w:br/>
+        <w:t xml:space="preserve">    print("\</w:t>
+      </w:r>
+      <w:proofErr w:type="spellStart"/>
+      <w:r>
+        <w:t>nFinal</w:t>
+      </w:r>
+      <w:proofErr w:type="spellEnd"/>
+      <w:r>
+        <w:t xml:space="preserve"> Results:")</w:t>
+      </w:r>
+      <w:r>
+        <w:br/>
+        <w:t xml:space="preserve">    print("Lambda | Accuracy | Sparsity")</w:t>
+      </w:r>
+      <w:r>
+        <w:br/>
+      </w:r>
+      <w:r>
+        <w:br/>
+        <w:t xml:space="preserve">    for r in results:</w:t>
+      </w:r>
+      <w:r>
+        <w:br/>
+        <w:t xml:space="preserve">        print(f"{r[0]} | {r[1]:.2f}% | {r[2]:.2f}%")</w:t>
+      </w:r>
+    </w:p>
+    <w:p>
+      <w:pPr>
+        <w:pStyle w:val="Heading1"/>
+      </w:pPr>
+    </w:p>
+    <w:p>
+      <w:pPr>
+        <w:pStyle w:val="Heading1"/>
+      </w:pPr>
+      <w:r>
+        <w:t>3.</w:t>
+      </w:r>
+      <w:r>
+        <w:t xml:space="preserve"> Results: Effect of λ on Accuracy and Sparsity</w:t>
       </w:r>
     </w:p>
     <w:tbl>
@@ -241,7 +2091,10 @@
         <w:pStyle w:val="Heading1"/>
       </w:pPr>
       <w:r>
-        <w:t>3. Gate Value Distribution</w:t>
+        <w:t>4.</w:t>
+      </w:r>
+      <w:r>
+        <w:t xml:space="preserve"> Gate Value Distribution</w:t>
       </w:r>
     </w:p>
     <w:p>
@@ -255,7 +2108,7 @@
           <w:noProof/>
         </w:rPr>
         <w:drawing>
-          <wp:inline distT="0" distB="0" distL="0" distR="0" wp14:anchorId="2D42A643" wp14:editId="70F13027">
+          <wp:inline distT="0" distB="0" distL="0" distR="0" wp14:anchorId="4F318FF5" wp14:editId="3B6C972D">
             <wp:extent cx="4572000" cy="3429000"/>
             <wp:effectExtent l="0" t="0" r="0" b="0"/>
             <wp:docPr id="1" name="Picture 1"/>
@@ -314,7 +2167,10 @@
         <w:pStyle w:val="Heading1"/>
       </w:pPr>
       <w:r>
-        <w:t>4. Conclusion</w:t>
+        <w:t>5.</w:t>
+      </w:r>
+      <w:r>
+        <w:t xml:space="preserve"> Conclusion</w:t>
       </w:r>
     </w:p>
     <w:p>
@@ -322,6 +2178,7 @@
         <w:t>The self-pruning neural network integrates pruning during training using gate parameters and L1 regularization. Increasing λ increases sparsity while slightly reducing accuracy. This demonstrates an effective trade-off between model compression and performance.</w:t>
       </w:r>
     </w:p>
+    <w:p/>
     <w:sectPr>
       <w:pgSz w:w="12240" w:h="15840"/>
       <w:pgMar w:top="1440" w:right="1800" w:bottom="1440" w:left="1800" w:header="720" w:footer="720" w:gutter="0"/>
@@ -924,7 +2781,7 @@
   <w:style w:type="paragraph" w:default="1" w:styleId="Normal">
     <w:name w:val="Normal"/>
     <w:qFormat/>
-    <w:rsid w:val="00FC693F"/>
+    <w:rsid w:val="00CA75CF"/>
   </w:style>
   <w:style w:type="paragraph" w:styleId="Heading1">
     <w:name w:val="heading 1"/>

</xml_diff>